<commit_message>
Renomeia projeto para Portal Notícias Maricá
</commit_message>
<xml_diff>
--- a/documentacao/Documentacao_Portal_Noticias_Marica.docx
+++ b/documentacao/Documentacao_Portal_Noticias_Marica.docx
@@ -67,7 +67,7 @@
           <w:sz w:val="40"/>
           <w:szCs w:val="40"/>
         </w:rPr>
-        <w:t xml:space="preserve">PORTAL DE ÚLTIMAS NOTÍCIAS DE MARICÁ</w:t>
+        <w:t xml:space="preserve">PORTAL NOTÍCIAS MARICÁ</w:t>
       </w:r>
     </w:p>
     <w:p>
@@ -376,7 +376,7 @@
           <w:sz w:val="22"/>
           <w:szCs w:val="22"/>
         </w:rPr>
-        <w:t xml:space="preserve">Este documento apresenta a documentação técnica do projeto "Portal de Últimas Notícias de Maricá", desenvolvido como entrega P1 (MVP) da disciplina Laboratório de Programação Full Stack, do curso de Engenharia de Software da Universidade de Vassouras, Campus Maricá.</w:t>
+        <w:t xml:space="preserve">Este documento apresenta a documentação técnica do projeto "Portal Notícias Maricá", desenvolvido como entrega P1 (MVP) da disciplina Laboratório de Programação Full Stack, do curso de Engenharia de Software da Universidade de Vassouras, Campus Maricá.</w:t>
       </w:r>
     </w:p>
     <w:p>

</xml_diff>